<commit_message>
Corrige paginacao: capa, sumario e identificacao cada um em sua pagina
O --toc automatico do pandoc insere o sumario logo depois do bloco de
titulo (mesma pagina), sem opcao de forcar quebra entre os dois nem no
.docx nem no .html/pdf (testado com template customizado para o html,
mas o docx nao e templatavel dessa forma). Solucao: remove --toc dos
dois scripts (gerar_pdf.ps1, gerar_docx.ps1) e volta a um "# Sumário"
manual (nao numerado), com os numeros dos itens escritos a mao mas
sincronizados com a numeracao automatica (--number-sections, que
continua ativo). Cada quebra de pagina agora e um bloco raw explicito
no corpo do documento (openxml para docx, html para pdf), o que se
mostrou 100% confiavel em ambos os formatos: capa -> quebra -> Sumario
-> quebra -> Identificacao -> quebra -> Resumo -> corpo.

Co-Authored-By: Claude Sonnet 5 <noreply@anthropic.com>
</commit_message>
<xml_diff>
--- a/relatorios/relatorio_descritivo_docentes_2025.docx
+++ b/relatorios/relatorio_descritivo_docentes_2025.docx
@@ -34,306 +34,18 @@
         <w:t xml:space="preserve">Setembro de 2026</w:t>
       </w:r>
     </w:p>
-    <w:sdt>
-      <w:sdtPr>
-        <w:docPartObj>
-          <w:docPartGallery w:val="Table of Contents"/>
-          <w:docPartUnique/>
-        </w:docPartObj>
-      </w:sdtPr>
-      <w:sdtContent>
-        <w:p>
-          <w:pPr>
-            <w:pStyle w:val="TOCHeading"/>
-          </w:pPr>
-          <w:r>
-            <w:t xml:space="preserve">Sumário</w:t>
-          </w:r>
-        </w:p>
-        <w:p>
-          <w:r>
-            <w:fldChar w:fldCharType="begin" w:dirty="true"/>
-            <w:instrText xml:space="preserve">TOC \o "1-2" \h \z \u</w:instrText>
-            <w:fldChar w:fldCharType="separate"/>
-            <w:fldChar w:fldCharType="end"/>
-          </w:r>
-        </w:p>
-      </w:sdtContent>
-    </w:sdt>
     <w:p>
       <w:r>
         <w:br w:type="page"/>
       </w:r>
     </w:p>
-    <w:bookmarkStart w:id="18" w:name="identificação"/>
+    <w:bookmarkStart w:id="18" w:name="sumário"/>
     <w:p>
       <w:pPr>
         <w:pStyle w:val="Heading1"/>
       </w:pPr>
       <w:r>
-        <w:t xml:space="preserve">Identificação</w:t>
-      </w:r>
-    </w:p>
-    <w:p>
-      <w:pPr>
-        <w:pStyle w:val="FirstParagraph"/>
-      </w:pPr>
-      <w:r>
-        <w:rPr>
-          <w:b/>
-          <w:bCs/>
-        </w:rPr>
-        <w:t xml:space="preserve">Docentes da Educação Básica: Vínculo Contratual e Etapa de Ensino</w:t>
-      </w:r>
-      <w:r>
-        <w:br/>
-      </w:r>
-      <w:r>
-        <w:t xml:space="preserve">Relatório descritivo — Censo Escolar (INEP), com cruzamento ao IDEB</w:t>
-      </w:r>
-    </w:p>
-    <w:p>
-      <w:pPr>
-        <w:pStyle w:val="BodyText"/>
-      </w:pPr>
-      <w:r>
-        <w:rPr>
-          <w:b/>
-          <w:bCs/>
-        </w:rPr>
-        <w:t xml:space="preserve">Autor</w:t>
-      </w:r>
-      <w:r>
-        <w:t xml:space="preserve">: Anderson Henrique</w:t>
-      </w:r>
-      <w:r>
-        <w:br/>
-      </w:r>
-      <w:r>
-        <w:t xml:space="preserve">Cientista político (Ph.D.); pesquisador de pós-doutorado, Centro de Estudos da Metrópole (CEM/USP), com apoio FAPESP</w:t>
-      </w:r>
-      <w:r>
-        <w:br/>
-      </w:r>
-      <w:r>
-        <w:t xml:space="preserve">Contato: andersonheri@gmail.com</w:t>
-      </w:r>
-    </w:p>
-    <w:p>
-      <w:pPr>
-        <w:pStyle w:val="BodyText"/>
-      </w:pPr>
-      <w:r>
-        <w:rPr>
-          <w:b/>
-          <w:bCs/>
-        </w:rPr>
-        <w:t xml:space="preserve">Fonte dos dados</w:t>
-      </w:r>
-      <w:r>
-        <w:t xml:space="preserve">: microdados públicos do Censo Escolar da Educação Básica e do IDEB (INEP). Os dados de origem são públicos; a síntese, as figuras e a interpretação reunidas neste relatório constituem material de entrega desta consultoria.</w:t>
-      </w:r>
-    </w:p>
-    <w:p>
-      <w:r>
-        <w:br w:type="page"/>
-      </w:r>
-    </w:p>
-    <w:bookmarkEnd w:id="18"/>
-    <w:bookmarkStart w:id="19" w:name="resumo"/>
-    <w:p>
-      <w:pPr>
-        <w:pStyle w:val="Heading1"/>
-      </w:pPr>
-      <w:r>
-        <w:t xml:space="preserve">Resumo</w:t>
-      </w:r>
-    </w:p>
-    <w:p>
-      <w:pPr>
-        <w:pStyle w:val="FirstParagraph"/>
-      </w:pPr>
-      <w:r>
-        <w:t xml:space="preserve">Este relatório descreve o vínculo contratual dos docentes da educação básica brasileira em 2025 (concursado/efetivo, contratado temporário, CLT ou terceirizado) e sua distribuição por rede de ensino, localização urbana/rural, região, UF e município, com base nos microdados do Censo Escolar (INEP). Complementarmente, descreve a evolução da força docente por etapa de ensino entre 2015 e 2025, e testa se a proporção de docentes contratados está associada ao desempenho educacional medido pelo IDEB 2025. Os resultados mostram que 40,8% dos docentes com vínculo informado (essencialmente a rede pública) são contratados, não concursados, com forte heterogeneidade entre redes (13,5% na rede federal a 49,6% na estadual), localização (37,6% na zona urbana a 56,4% na rural) e território (10,5% no Rio de Janeiro a 67,7% no Acre, entre UFs; de 0% a mais de 96% entre municípios). A correlação entre essa proporção e o IDEB é estatisticamente significativa ao nível de município, mas de magnitude muito baixa (r entre -0,04 e -0,11), e não significativa ao nível de UF, não sustentando o vínculo contratual como fator explicativo relevante e isolado do desempenho educacional.</w:t>
-      </w:r>
-    </w:p>
-    <w:bookmarkEnd w:id="19"/>
-    <w:bookmarkStart w:id="20" w:name="introdução-e-objetivo"/>
-    <w:p>
-      <w:pPr>
-        <w:pStyle w:val="Heading1"/>
-      </w:pPr>
-      <w:r>
-        <w:rPr>
-          <w:rStyle w:val="SectionNumber"/>
-        </w:rPr>
-        <w:t xml:space="preserve">1</w:t>
-      </w:r>
-      <w:r>
-        <w:tab/>
-      </w:r>
-      <w:r>
-        <w:t xml:space="preserve">Introdução e objetivo</w:t>
-      </w:r>
-    </w:p>
-    <w:p>
-      <w:pPr>
-        <w:pStyle w:val="FirstParagraph"/>
-      </w:pPr>
-      <w:r>
-        <w:t xml:space="preserve">Este relatório descreve o perfil dos docentes da educação básica brasileira em 2025, com foco em duas dimensões: a etapa de ensino em que atuam (educação infantil, anos iniciais e finais do fundamental, ensino médio) e, principalmente, o tipo de vínculo contratual que mantêm com a rede de ensino (concursado/efetivo, contratado temporário, CLT ou terceirizado). A pergunta central é simples de enunciar e relevante para a gestão educacional: que proporção do corpo docente brasileiro trabalha sem estabilidade de vínculo (contratos temporários, CLT ou terceirização), e como essa proporção varia entre redes de ensino, regiões, UFs e municípios?</w:t>
-      </w:r>
-    </w:p>
-    <w:p>
-      <w:pPr>
-        <w:pStyle w:val="BodyText"/>
-      </w:pPr>
-      <w:r>
-        <w:t xml:space="preserve">Como desdobramento, o relatório também examina se essa característica do vínculo contratual está associada ao desempenho educacional medido pelo IDEB, testando a hipótese de que uma maior proporção de docentes contratados (em vez de concursados) esteja relacionada a resultados piores.</w:t>
-      </w:r>
-    </w:p>
-    <w:p>
-      <w:pPr>
-        <w:pStyle w:val="BodyText"/>
-      </w:pPr>
-      <w:r>
-        <w:t xml:space="preserve">O relatório é descritivo: apresenta distribuições, comparações entre grupos e uma análise de correlação simples. Não se trata de uma análise causal, e as limitações de cada etapa são explicitadas ao longo do texto.</w:t>
-      </w:r>
-    </w:p>
-    <w:bookmarkEnd w:id="20"/>
-    <w:bookmarkStart w:id="21" w:name="dados-e-método"/>
-    <w:p>
-      <w:pPr>
-        <w:pStyle w:val="Heading1"/>
-      </w:pPr>
-      <w:r>
-        <w:rPr>
-          <w:rStyle w:val="SectionNumber"/>
-        </w:rPr>
-        <w:t xml:space="preserve">2</w:t>
-      </w:r>
-      <w:r>
-        <w:tab/>
-      </w:r>
-      <w:r>
-        <w:t xml:space="preserve">Dados e método</w:t>
-      </w:r>
-    </w:p>
-    <w:p>
-      <w:pPr>
-        <w:pStyle w:val="FirstParagraph"/>
-      </w:pPr>
-      <w:r>
-        <w:rPr>
-          <w:b/>
-          <w:bCs/>
-        </w:rPr>
-        <w:t xml:space="preserve">Etapa de ensino.</w:t>
-      </w:r>
-      <w:r>
-        <w:t xml:space="preserve"> </w:t>
-      </w:r>
-      <w:r>
-        <w:t xml:space="preserve">A variável de etapa (quantos docentes atuam na educação infantil, nos anos iniciais e finais do fundamental e no ensino médio) está disponível em todos os Censos Escolares de 2015 a 2025, permitindo observar a evolução da década.</w:t>
-      </w:r>
-    </w:p>
-    <w:p>
-      <w:pPr>
-        <w:pStyle w:val="BodyText"/>
-      </w:pPr>
-      <w:r>
-        <w:rPr>
-          <w:b/>
-          <w:bCs/>
-        </w:rPr>
-        <w:t xml:space="preserve">Vínculo contratual.</w:t>
-      </w:r>
-      <w:r>
-        <w:t xml:space="preserve"> </w:t>
-      </w:r>
-      <w:r>
-        <w:t xml:space="preserve">A variável de vínculo contratual do docente (</w:t>
-      </w:r>
-      <w:r>
-        <w:rPr>
-          <w:rStyle w:val="VerbatimChar"/>
-        </w:rPr>
-        <w:t xml:space="preserve">QT_DOC_BAS_VINCULO_CONCUR</w:t>
-      </w:r>
-      <w:r>
-        <w:t xml:space="preserve">,</w:t>
-      </w:r>
-      <w:r>
-        <w:t xml:space="preserve"> </w:t>
-      </w:r>
-      <w:r>
-        <w:rPr>
-          <w:rStyle w:val="VerbatimChar"/>
-        </w:rPr>
-        <w:t xml:space="preserve">_CONTRA</w:t>
-      </w:r>
-      <w:r>
-        <w:t xml:space="preserve">,</w:t>
-      </w:r>
-      <w:r>
-        <w:t xml:space="preserve"> </w:t>
-      </w:r>
-      <w:r>
-        <w:rPr>
-          <w:rStyle w:val="VerbatimChar"/>
-        </w:rPr>
-        <w:t xml:space="preserve">_TERCEIR</w:t>
-      </w:r>
-      <w:r>
-        <w:t xml:space="preserve">,</w:t>
-      </w:r>
-      <w:r>
-        <w:t xml:space="preserve"> </w:t>
-      </w:r>
-      <w:r>
-        <w:rPr>
-          <w:rStyle w:val="VerbatimChar"/>
-        </w:rPr>
-        <w:t xml:space="preserve">_CLT</w:t>
-      </w:r>
-      <w:r>
-        <w:t xml:space="preserve">) só passou a existir no Censo Escolar a partir da edição de 2025. Isso foi confirmado exaustivamente nos microdados de 2015 a 2024: a variável simplesmente não existe nessas edições. Por esse motivo, toda a análise de vínculo contratual deste relatório é um retrato do ano de 2025, sem série histórica.</w:t>
-      </w:r>
-    </w:p>
-    <w:p>
-      <w:pPr>
-        <w:pStyle w:val="BodyText"/>
-      </w:pPr>
-      <w:r>
-        <w:rPr>
-          <w:b/>
-          <w:bCs/>
-        </w:rPr>
-        <w:t xml:space="preserve">A variável de vínculo só é informada para a rede pública.</w:t>
-      </w:r>
-      <w:r>
-        <w:t xml:space="preserve"> </w:t>
-      </w:r>
-      <w:r>
-        <w:t xml:space="preserve">A rede privada (federal, estadual e municipal são as três redes públicas; a quarta categoria de dependência administrativa é a rede privada) não reporta essa informação ao Censo — as quatro categorias de vínculo aparecem como zero para 100% dos docentes da rede privada. Isso é coerente com a própria natureza da variável (vínculo estatutário/CLT/temporário é um conceito de gestão de pessoal do setor público) e é tratado de forma explícita ao longo do relatório: a rede privada representa 651.655 docentes da educação básica em 2025 (21,8% do total), e todos eles ficam fora do indicador de vínculo.</w:t>
-      </w:r>
-    </w:p>
-    <w:p>
-      <w:pPr>
-        <w:pStyle w:val="BodyText"/>
-      </w:pPr>
-      <w:r>
-        <w:rPr>
-          <w:b/>
-          <w:bCs/>
-        </w:rPr>
-        <w:t xml:space="preserve">Duas bases de cálculo para as percentagens de vínculo.</w:t>
-      </w:r>
-      <w:r>
-        <w:t xml:space="preserve"> </w:t>
-      </w:r>
-      <w:r>
-        <w:t xml:space="preserve">Ao longo do relatório, os percentuais de vínculo (concursado, contratado, CLT, terceirizado) aparecem calculados sobre duas bases diferentes, dependendo da comparação:</w:t>
+        <w:t xml:space="preserve">Sumário</w:t>
       </w:r>
     </w:p>
     <w:p>
@@ -345,17 +57,7 @@
         </w:numPr>
       </w:pPr>
       <w:r>
-        <w:rPr>
-          <w:b/>
-          <w:bCs/>
-        </w:rPr>
-        <w:t xml:space="preserve">(a) sobre o total de docentes do grupo</w:t>
-      </w:r>
-      <w:r>
-        <w:t xml:space="preserve"> </w:t>
-      </w:r>
-      <w:r>
-        <w:t xml:space="preserve">(denominador = total de docentes da educação básica daquele grupo, incluindo a rede privada quando o grupo mistura redes, como uma UF ou um município). Essa é a base usada nos rankings por município e por UF.</w:t>
+        <w:t xml:space="preserve">Identificação</w:t>
       </w:r>
     </w:p>
     <w:p>
@@ -367,37 +69,172 @@
         </w:numPr>
       </w:pPr>
       <w:r>
+        <w:t xml:space="preserve">Resumo</w:t>
+      </w:r>
+    </w:p>
+    <w:p>
+      <w:pPr>
+        <w:pStyle w:val="Compact"/>
+        <w:numPr>
+          <w:ilvl w:val="0"/>
+          <w:numId w:val="1001"/>
+        </w:numPr>
+      </w:pPr>
+      <w:r>
+        <w:t xml:space="preserve">1 Introdução e objetivo</w:t>
+      </w:r>
+    </w:p>
+    <w:p>
+      <w:pPr>
+        <w:pStyle w:val="Compact"/>
+        <w:numPr>
+          <w:ilvl w:val="0"/>
+          <w:numId w:val="1001"/>
+        </w:numPr>
+      </w:pPr>
+      <w:r>
+        <w:t xml:space="preserve">2 Dados e método</w:t>
+      </w:r>
+    </w:p>
+    <w:p>
+      <w:pPr>
+        <w:pStyle w:val="Compact"/>
+        <w:numPr>
+          <w:ilvl w:val="0"/>
+          <w:numId w:val="1001"/>
+        </w:numPr>
+      </w:pPr>
+      <w:r>
+        <w:t xml:space="preserve">3 Panorama geral do vínculo contratual dos docentes (Brasil, 2025)</w:t>
+      </w:r>
+    </w:p>
+    <w:p>
+      <w:pPr>
+        <w:pStyle w:val="Compact"/>
+        <w:numPr>
+          <w:ilvl w:val="0"/>
+          <w:numId w:val="1001"/>
+        </w:numPr>
+      </w:pPr>
+      <w:r>
+        <w:t xml:space="preserve">4 Vínculo por rede de ensino (dependência administrativa)</w:t>
+      </w:r>
+    </w:p>
+    <w:p>
+      <w:pPr>
+        <w:pStyle w:val="Compact"/>
+        <w:numPr>
+          <w:ilvl w:val="0"/>
+          <w:numId w:val="1001"/>
+        </w:numPr>
+      </w:pPr>
+      <w:r>
+        <w:t xml:space="preserve">5 Vínculo por localização (urbana e rural)</w:t>
+      </w:r>
+    </w:p>
+    <w:p>
+      <w:pPr>
+        <w:pStyle w:val="Compact"/>
+        <w:numPr>
+          <w:ilvl w:val="0"/>
+          <w:numId w:val="1001"/>
+        </w:numPr>
+      </w:pPr>
+      <w:r>
+        <w:t xml:space="preserve">6 Vínculo por região e Unidade da Federação</w:t>
+      </w:r>
+    </w:p>
+    <w:p>
+      <w:pPr>
+        <w:pStyle w:val="Compact"/>
+        <w:numPr>
+          <w:ilvl w:val="0"/>
+          <w:numId w:val="1001"/>
+        </w:numPr>
+      </w:pPr>
+      <w:r>
+        <w:t xml:space="preserve">7 Heterogeneidade municipal do vínculo contratual</w:t>
+      </w:r>
+    </w:p>
+    <w:p>
+      <w:pPr>
+        <w:pStyle w:val="Compact"/>
+        <w:numPr>
+          <w:ilvl w:val="0"/>
+          <w:numId w:val="1001"/>
+        </w:numPr>
+      </w:pPr>
+      <w:r>
+        <w:t xml:space="preserve">8 Evolução do quadro docente por etapa de ensino (2015 a 2025)</w:t>
+      </w:r>
+    </w:p>
+    <w:p>
+      <w:pPr>
+        <w:pStyle w:val="Compact"/>
+        <w:numPr>
+          <w:ilvl w:val="0"/>
+          <w:numId w:val="1001"/>
+        </w:numPr>
+      </w:pPr>
+      <w:r>
+        <w:t xml:space="preserve">9 Cruzamento entre vínculo contratual e desempenho educacional (IDEB)</w:t>
+      </w:r>
+    </w:p>
+    <w:p>
+      <w:pPr>
+        <w:pStyle w:val="Compact"/>
+        <w:numPr>
+          <w:ilvl w:val="0"/>
+          <w:numId w:val="1001"/>
+        </w:numPr>
+      </w:pPr>
+      <w:r>
+        <w:t xml:space="preserve">10 Discussão e síntese das conclusões</w:t>
+      </w:r>
+    </w:p>
+    <w:p>
+      <w:pPr>
+        <w:pStyle w:val="Compact"/>
+        <w:numPr>
+          <w:ilvl w:val="0"/>
+          <w:numId w:val="1001"/>
+        </w:numPr>
+      </w:pPr>
+      <w:r>
+        <w:t xml:space="preserve">11 Fontes e material de apoio</w:t>
+      </w:r>
+    </w:p>
+    <w:p>
+      <w:r>
+        <w:br w:type="page"/>
+      </w:r>
+    </w:p>
+    <w:bookmarkEnd w:id="18"/>
+    <w:bookmarkStart w:id="19" w:name="identificação"/>
+    <w:p>
+      <w:pPr>
+        <w:pStyle w:val="Heading1"/>
+      </w:pPr>
+      <w:r>
+        <w:t xml:space="preserve">Identificação</w:t>
+      </w:r>
+    </w:p>
+    <w:p>
+      <w:pPr>
+        <w:pStyle w:val="FirstParagraph"/>
+      </w:pPr>
+      <w:r>
         <w:rPr>
           <w:b/>
           <w:bCs/>
         </w:rPr>
-        <w:t xml:space="preserve">(b) sobre o subtotal de docentes com vínculo efetivamente informado</w:t>
-      </w:r>
-      <w:r>
-        <w:t xml:space="preserve"> </w:t>
-      </w:r>
-      <w:r>
-        <w:t xml:space="preserve">(soma das quatro categorias de vínculo, que na prática coincide com a rede pública). Essa é a base usada nas comparações por rede de ensino, localização urbana/rural, região e no total nacional.</w:t>
-      </w:r>
-    </w:p>
-    <w:p>
-      <w:pPr>
-        <w:pStyle w:val="FirstParagraph"/>
-      </w:pPr>
-      <w:r>
-        <w:t xml:space="preserve">Como o</w:t>
-      </w:r>
-      <w:r>
-        <w:t xml:space="preserve"> </w:t>
-      </w:r>
-      <w:r>
-        <w:t xml:space="preserve">“não informado”</w:t>
-      </w:r>
-      <w:r>
-        <w:t xml:space="preserve"> </w:t>
-      </w:r>
-      <w:r>
-        <w:t xml:space="preserve">é, na prática, quase inteiramente a rede privada, os dois cálculos convergem dentro de um grupo 100% público (uma rede estadual, por exemplo) e diferem quando o grupo mistura rede pública e privada. Um exemplo concreto: nacionalmente, 32,3% do total geral de docentes são contratados (base a, denominador inclui a rede privada), mas 40,8% dos docentes com vínculo informado são contratados (base b, denominador é só quem responde a essa variável). Cada seção deste relatório indica qual base está sendo usada.</w:t>
+        <w:t xml:space="preserve">Docentes da Educação Básica: Vínculo Contratual e Etapa de Ensino</w:t>
+      </w:r>
+      <w:r>
+        <w:br/>
+      </w:r>
+      <w:r>
+        <w:t xml:space="preserve">Relatório descritivo — Censo Escolar (INEP), com cruzamento ao IDEB</w:t>
       </w:r>
     </w:p>
     <w:p>
@@ -409,58 +246,22 @@
           <w:b/>
           <w:bCs/>
         </w:rPr>
-        <w:t xml:space="preserve">Docentes podem atuar em mais de uma etapa.</w:t>
-      </w:r>
-      <w:r>
-        <w:t xml:space="preserve"> </w:t>
-      </w:r>
-      <w:r>
-        <w:t xml:space="preserve">As variáveis de etapa (</w:t>
-      </w:r>
-      <w:r>
-        <w:rPr>
-          <w:rStyle w:val="VerbatimChar"/>
-        </w:rPr>
-        <w:t xml:space="preserve">QT_DOC_INF</w:t>
-      </w:r>
-      <w:r>
-        <w:t xml:space="preserve">,</w:t>
-      </w:r>
-      <w:r>
-        <w:t xml:space="preserve"> </w:t>
-      </w:r>
-      <w:r>
-        <w:rPr>
-          <w:rStyle w:val="VerbatimChar"/>
-        </w:rPr>
-        <w:t xml:space="preserve">QT_DOC_FUND_AI</w:t>
-      </w:r>
-      <w:r>
-        <w:t xml:space="preserve">,</w:t>
-      </w:r>
-      <w:r>
-        <w:t xml:space="preserve"> </w:t>
-      </w:r>
-      <w:r>
-        <w:rPr>
-          <w:rStyle w:val="VerbatimChar"/>
-        </w:rPr>
-        <w:t xml:space="preserve">QT_DOC_FUND_AF</w:t>
-      </w:r>
-      <w:r>
-        <w:t xml:space="preserve">,</w:t>
-      </w:r>
-      <w:r>
-        <w:t xml:space="preserve"> </w:t>
-      </w:r>
-      <w:r>
-        <w:rPr>
-          <w:rStyle w:val="VerbatimChar"/>
-        </w:rPr>
-        <w:t xml:space="preserve">QT_DOC_MED</w:t>
-      </w:r>
-      <w:r>
-        <w:t xml:space="preserve">) não são mutuamente exclusivas: um mesmo docente que leciona, por exemplo, tanto nos anos finais do fundamental quanto no ensino médio é contabilizado nas duas categorias. Por isso, ao somar as participações de cada etapa dentro de um grupo, o total pode superar 100%. Isso é normal e esperado nos microdados do Censo, e é mencionado sempre que relevante.</w:t>
+        <w:t xml:space="preserve">Autor</w:t>
+      </w:r>
+      <w:r>
+        <w:t xml:space="preserve">: Anderson Henrique</w:t>
+      </w:r>
+      <w:r>
+        <w:br/>
+      </w:r>
+      <w:r>
+        <w:t xml:space="preserve">Cientista político (Ph.D.); pesquisador de pós-doutorado, Centro de Estudos da Metrópole (CEM/USP), com apoio FAPESP</w:t>
+      </w:r>
+      <w:r>
+        <w:br/>
+      </w:r>
+      <w:r>
+        <w:t xml:space="preserve">Contato: andersonheri@gmail.com</w:t>
       </w:r>
     </w:p>
     <w:p>
@@ -472,6 +273,350 @@
           <w:b/>
           <w:bCs/>
         </w:rPr>
+        <w:t xml:space="preserve">Fonte dos dados</w:t>
+      </w:r>
+      <w:r>
+        <w:t xml:space="preserve">: microdados públicos do Censo Escolar da Educação Básica e do IDEB (INEP). Os dados de origem são públicos; a síntese, as figuras e a interpretação reunidas neste relatório constituem material de entrega desta consultoria.</w:t>
+      </w:r>
+    </w:p>
+    <w:p>
+      <w:r>
+        <w:br w:type="page"/>
+      </w:r>
+    </w:p>
+    <w:bookmarkEnd w:id="19"/>
+    <w:bookmarkStart w:id="20" w:name="resumo"/>
+    <w:p>
+      <w:pPr>
+        <w:pStyle w:val="Heading1"/>
+      </w:pPr>
+      <w:r>
+        <w:t xml:space="preserve">Resumo</w:t>
+      </w:r>
+    </w:p>
+    <w:p>
+      <w:pPr>
+        <w:pStyle w:val="FirstParagraph"/>
+      </w:pPr>
+      <w:r>
+        <w:t xml:space="preserve">Este relatório descreve o vínculo contratual dos docentes da educação básica brasileira em 2025 (concursado/efetivo, contratado temporário, CLT ou terceirizado) e sua distribuição por rede de ensino, localização urbana/rural, região, UF e município, com base nos microdados do Censo Escolar (INEP). Complementarmente, descreve a evolução da força docente por etapa de ensino entre 2015 e 2025, e testa se a proporção de docentes contratados está associada ao desempenho educacional medido pelo IDEB 2025. Os resultados mostram que 40,8% dos docentes com vínculo informado (essencialmente a rede pública) são contratados, não concursados, com forte heterogeneidade entre redes (13,5% na rede federal a 49,6% na estadual), localização (37,6% na zona urbana a 56,4% na rural) e território (10,5% no Rio de Janeiro a 67,7% no Acre, entre UFs; de 0% a mais de 96% entre municípios). A correlação entre essa proporção e o IDEB é estatisticamente significativa ao nível de município, mas de magnitude muito baixa (r entre -0,04 e -0,11), e não significativa ao nível de UF, não sustentando o vínculo contratual como fator explicativo relevante e isolado do desempenho educacional.</w:t>
+      </w:r>
+    </w:p>
+    <w:bookmarkEnd w:id="20"/>
+    <w:bookmarkStart w:id="21" w:name="introdução-e-objetivo"/>
+    <w:p>
+      <w:pPr>
+        <w:pStyle w:val="Heading1"/>
+      </w:pPr>
+      <w:r>
+        <w:rPr>
+          <w:rStyle w:val="SectionNumber"/>
+        </w:rPr>
+        <w:t xml:space="preserve">1</w:t>
+      </w:r>
+      <w:r>
+        <w:tab/>
+      </w:r>
+      <w:r>
+        <w:t xml:space="preserve">Introdução e objetivo</w:t>
+      </w:r>
+    </w:p>
+    <w:p>
+      <w:pPr>
+        <w:pStyle w:val="FirstParagraph"/>
+      </w:pPr>
+      <w:r>
+        <w:t xml:space="preserve">Este relatório descreve o perfil dos docentes da educação básica brasileira em 2025, com foco em duas dimensões: a etapa de ensino em que atuam (educação infantil, anos iniciais e finais do fundamental, ensino médio) e, principalmente, o tipo de vínculo contratual que mantêm com a rede de ensino (concursado/efetivo, contratado temporário, CLT ou terceirizado). A pergunta central é simples de enunciar e relevante para a gestão educacional: que proporção do corpo docente brasileiro trabalha sem estabilidade de vínculo (contratos temporários, CLT ou terceirização), e como essa proporção varia entre redes de ensino, regiões, UFs e municípios?</w:t>
+      </w:r>
+    </w:p>
+    <w:p>
+      <w:pPr>
+        <w:pStyle w:val="BodyText"/>
+      </w:pPr>
+      <w:r>
+        <w:t xml:space="preserve">Como desdobramento, o relatório também examina se essa característica do vínculo contratual está associada ao desempenho educacional medido pelo IDEB, testando a hipótese de que uma maior proporção de docentes contratados (em vez de concursados) esteja relacionada a resultados piores.</w:t>
+      </w:r>
+    </w:p>
+    <w:p>
+      <w:pPr>
+        <w:pStyle w:val="BodyText"/>
+      </w:pPr>
+      <w:r>
+        <w:t xml:space="preserve">O relatório é descritivo: apresenta distribuições, comparações entre grupos e uma análise de correlação simples. Não se trata de uma análise causal, e as limitações de cada etapa são explicitadas ao longo do texto.</w:t>
+      </w:r>
+    </w:p>
+    <w:bookmarkEnd w:id="21"/>
+    <w:bookmarkStart w:id="22" w:name="dados-e-método"/>
+    <w:p>
+      <w:pPr>
+        <w:pStyle w:val="Heading1"/>
+      </w:pPr>
+      <w:r>
+        <w:rPr>
+          <w:rStyle w:val="SectionNumber"/>
+        </w:rPr>
+        <w:t xml:space="preserve">2</w:t>
+      </w:r>
+      <w:r>
+        <w:tab/>
+      </w:r>
+      <w:r>
+        <w:t xml:space="preserve">Dados e método</w:t>
+      </w:r>
+    </w:p>
+    <w:p>
+      <w:pPr>
+        <w:pStyle w:val="FirstParagraph"/>
+      </w:pPr>
+      <w:r>
+        <w:rPr>
+          <w:b/>
+          <w:bCs/>
+        </w:rPr>
+        <w:t xml:space="preserve">Etapa de ensino.</w:t>
+      </w:r>
+      <w:r>
+        <w:t xml:space="preserve"> </w:t>
+      </w:r>
+      <w:r>
+        <w:t xml:space="preserve">A variável de etapa (quantos docentes atuam na educação infantil, nos anos iniciais e finais do fundamental e no ensino médio) está disponível em todos os Censos Escolares de 2015 a 2025, permitindo observar a evolução da década.</w:t>
+      </w:r>
+    </w:p>
+    <w:p>
+      <w:pPr>
+        <w:pStyle w:val="BodyText"/>
+      </w:pPr>
+      <w:r>
+        <w:rPr>
+          <w:b/>
+          <w:bCs/>
+        </w:rPr>
+        <w:t xml:space="preserve">Vínculo contratual.</w:t>
+      </w:r>
+      <w:r>
+        <w:t xml:space="preserve"> </w:t>
+      </w:r>
+      <w:r>
+        <w:t xml:space="preserve">A variável de vínculo contratual do docente (</w:t>
+      </w:r>
+      <w:r>
+        <w:rPr>
+          <w:rStyle w:val="VerbatimChar"/>
+        </w:rPr>
+        <w:t xml:space="preserve">QT_DOC_BAS_VINCULO_CONCUR</w:t>
+      </w:r>
+      <w:r>
+        <w:t xml:space="preserve">,</w:t>
+      </w:r>
+      <w:r>
+        <w:t xml:space="preserve"> </w:t>
+      </w:r>
+      <w:r>
+        <w:rPr>
+          <w:rStyle w:val="VerbatimChar"/>
+        </w:rPr>
+        <w:t xml:space="preserve">_CONTRA</w:t>
+      </w:r>
+      <w:r>
+        <w:t xml:space="preserve">,</w:t>
+      </w:r>
+      <w:r>
+        <w:t xml:space="preserve"> </w:t>
+      </w:r>
+      <w:r>
+        <w:rPr>
+          <w:rStyle w:val="VerbatimChar"/>
+        </w:rPr>
+        <w:t xml:space="preserve">_TERCEIR</w:t>
+      </w:r>
+      <w:r>
+        <w:t xml:space="preserve">,</w:t>
+      </w:r>
+      <w:r>
+        <w:t xml:space="preserve"> </w:t>
+      </w:r>
+      <w:r>
+        <w:rPr>
+          <w:rStyle w:val="VerbatimChar"/>
+        </w:rPr>
+        <w:t xml:space="preserve">_CLT</w:t>
+      </w:r>
+      <w:r>
+        <w:t xml:space="preserve">) só passou a existir no Censo Escolar a partir da edição de 2025. Isso foi confirmado exaustivamente nos microdados de 2015 a 2024: a variável simplesmente não existe nessas edições. Por esse motivo, toda a análise de vínculo contratual deste relatório é um retrato do ano de 2025, sem série histórica.</w:t>
+      </w:r>
+    </w:p>
+    <w:p>
+      <w:pPr>
+        <w:pStyle w:val="BodyText"/>
+      </w:pPr>
+      <w:r>
+        <w:rPr>
+          <w:b/>
+          <w:bCs/>
+        </w:rPr>
+        <w:t xml:space="preserve">A variável de vínculo só é informada para a rede pública.</w:t>
+      </w:r>
+      <w:r>
+        <w:t xml:space="preserve"> </w:t>
+      </w:r>
+      <w:r>
+        <w:t xml:space="preserve">A rede privada (federal, estadual e municipal são as três redes públicas; a quarta categoria de dependência administrativa é a rede privada) não reporta essa informação ao Censo — as quatro categorias de vínculo aparecem como zero para 100% dos docentes da rede privada. Isso é coerente com a própria natureza da variável (vínculo estatutário/CLT/temporário é um conceito de gestão de pessoal do setor público) e é tratado de forma explícita ao longo do relatório: a rede privada representa 651.655 docentes da educação básica em 2025 (21,8% do total), e todos eles ficam fora do indicador de vínculo.</w:t>
+      </w:r>
+    </w:p>
+    <w:p>
+      <w:pPr>
+        <w:pStyle w:val="BodyText"/>
+      </w:pPr>
+      <w:r>
+        <w:rPr>
+          <w:b/>
+          <w:bCs/>
+        </w:rPr>
+        <w:t xml:space="preserve">Duas bases de cálculo para as percentagens de vínculo.</w:t>
+      </w:r>
+      <w:r>
+        <w:t xml:space="preserve"> </w:t>
+      </w:r>
+      <w:r>
+        <w:t xml:space="preserve">Ao longo do relatório, os percentuais de vínculo (concursado, contratado, CLT, terceirizado) aparecem calculados sobre duas bases diferentes, dependendo da comparação:</w:t>
+      </w:r>
+    </w:p>
+    <w:p>
+      <w:pPr>
+        <w:pStyle w:val="Compact"/>
+        <w:numPr>
+          <w:ilvl w:val="0"/>
+          <w:numId w:val="1002"/>
+        </w:numPr>
+      </w:pPr>
+      <w:r>
+        <w:rPr>
+          <w:b/>
+          <w:bCs/>
+        </w:rPr>
+        <w:t xml:space="preserve">(a) sobre o total de docentes do grupo</w:t>
+      </w:r>
+      <w:r>
+        <w:t xml:space="preserve"> </w:t>
+      </w:r>
+      <w:r>
+        <w:t xml:space="preserve">(denominador = total de docentes da educação básica daquele grupo, incluindo a rede privada quando o grupo mistura redes, como uma UF ou um município). Essa é a base usada nos rankings por município e por UF.</w:t>
+      </w:r>
+    </w:p>
+    <w:p>
+      <w:pPr>
+        <w:pStyle w:val="Compact"/>
+        <w:numPr>
+          <w:ilvl w:val="0"/>
+          <w:numId w:val="1002"/>
+        </w:numPr>
+      </w:pPr>
+      <w:r>
+        <w:rPr>
+          <w:b/>
+          <w:bCs/>
+        </w:rPr>
+        <w:t xml:space="preserve">(b) sobre o subtotal de docentes com vínculo efetivamente informado</w:t>
+      </w:r>
+      <w:r>
+        <w:t xml:space="preserve"> </w:t>
+      </w:r>
+      <w:r>
+        <w:t xml:space="preserve">(soma das quatro categorias de vínculo, que na prática coincide com a rede pública). Essa é a base usada nas comparações por rede de ensino, localização urbana/rural, região e no total nacional.</w:t>
+      </w:r>
+    </w:p>
+    <w:p>
+      <w:pPr>
+        <w:pStyle w:val="FirstParagraph"/>
+      </w:pPr>
+      <w:r>
+        <w:t xml:space="preserve">Como o</w:t>
+      </w:r>
+      <w:r>
+        <w:t xml:space="preserve"> </w:t>
+      </w:r>
+      <w:r>
+        <w:t xml:space="preserve">“não informado”</w:t>
+      </w:r>
+      <w:r>
+        <w:t xml:space="preserve"> </w:t>
+      </w:r>
+      <w:r>
+        <w:t xml:space="preserve">é, na prática, quase inteiramente a rede privada, os dois cálculos convergem dentro de um grupo 100% público (uma rede estadual, por exemplo) e diferem quando o grupo mistura rede pública e privada. Um exemplo concreto: nacionalmente, 32,3% do total geral de docentes são contratados (base a, denominador inclui a rede privada), mas 40,8% dos docentes com vínculo informado são contratados (base b, denominador é só quem responde a essa variável). Cada seção deste relatório indica qual base está sendo usada.</w:t>
+      </w:r>
+    </w:p>
+    <w:p>
+      <w:pPr>
+        <w:pStyle w:val="BodyText"/>
+      </w:pPr>
+      <w:r>
+        <w:rPr>
+          <w:b/>
+          <w:bCs/>
+        </w:rPr>
+        <w:t xml:space="preserve">Docentes podem atuar em mais de uma etapa.</w:t>
+      </w:r>
+      <w:r>
+        <w:t xml:space="preserve"> </w:t>
+      </w:r>
+      <w:r>
+        <w:t xml:space="preserve">As variáveis de etapa (</w:t>
+      </w:r>
+      <w:r>
+        <w:rPr>
+          <w:rStyle w:val="VerbatimChar"/>
+        </w:rPr>
+        <w:t xml:space="preserve">QT_DOC_INF</w:t>
+      </w:r>
+      <w:r>
+        <w:t xml:space="preserve">,</w:t>
+      </w:r>
+      <w:r>
+        <w:t xml:space="preserve"> </w:t>
+      </w:r>
+      <w:r>
+        <w:rPr>
+          <w:rStyle w:val="VerbatimChar"/>
+        </w:rPr>
+        <w:t xml:space="preserve">QT_DOC_FUND_AI</w:t>
+      </w:r>
+      <w:r>
+        <w:t xml:space="preserve">,</w:t>
+      </w:r>
+      <w:r>
+        <w:t xml:space="preserve"> </w:t>
+      </w:r>
+      <w:r>
+        <w:rPr>
+          <w:rStyle w:val="VerbatimChar"/>
+        </w:rPr>
+        <w:t xml:space="preserve">QT_DOC_FUND_AF</w:t>
+      </w:r>
+      <w:r>
+        <w:t xml:space="preserve">,</w:t>
+      </w:r>
+      <w:r>
+        <w:t xml:space="preserve"> </w:t>
+      </w:r>
+      <w:r>
+        <w:rPr>
+          <w:rStyle w:val="VerbatimChar"/>
+        </w:rPr>
+        <w:t xml:space="preserve">QT_DOC_MED</w:t>
+      </w:r>
+      <w:r>
+        <w:t xml:space="preserve">) não são mutuamente exclusivas: um mesmo docente que leciona, por exemplo, tanto nos anos finais do fundamental quanto no ensino médio é contabilizado nas duas categorias. Por isso, ao somar as participações de cada etapa dentro de um grupo, o total pode superar 100%. Isso é normal e esperado nos microdados do Censo, e é mencionado sempre que relevante.</w:t>
+      </w:r>
+    </w:p>
+    <w:p>
+      <w:pPr>
+        <w:pStyle w:val="BodyText"/>
+      </w:pPr>
+      <w:r>
+        <w:rPr>
+          <w:b/>
+          <w:bCs/>
+        </w:rPr>
         <w:t xml:space="preserve">IDEB.</w:t>
       </w:r>
       <w:r>
@@ -493,8 +638,8 @@
         <w:t xml:space="preserve">(a rede municipal não oferece ensino médio e a rede federal é residual e não aparece separada nessa aba); nesse caso específico, usou-se a rede Estadual como proxy da rede pública, o que é razoável dado que o ensino médio público é, na prática, quase inteiramente estadual.</w:t>
       </w:r>
     </w:p>
-    <w:bookmarkEnd w:id="21"/>
-    <w:bookmarkStart w:id="25" w:name="X125bd23ce2ac1401cc5d9877cbc5ddcc837c71b"/>
+    <w:bookmarkEnd w:id="22"/>
+    <w:bookmarkStart w:id="26" w:name="X125bd23ce2ac1401cc5d9877cbc5ddcc837c71b"/>
     <w:p>
       <w:pPr>
         <w:pStyle w:val="Heading1"/>
@@ -537,18 +682,18 @@
           <wp:inline>
             <wp:extent cx="5334000" cy="3200399"/>
             <wp:effectExtent b="0" l="0" r="0" t="0"/>
-            <wp:docPr descr="Docentes por vínculo contratual, Brasil 2025" title="" id="23" name="Picture"/>
+            <wp:docPr descr="Docentes por vínculo contratual, Brasil 2025" title="" id="24" name="Picture"/>
             <a:graphic>
               <a:graphicData uri="http://schemas.openxmlformats.org/drawingml/2006/picture">
                 <pic:pic>
                   <pic:nvPicPr>
-                    <pic:cNvPr descr="../outputs/figures/02_docentes_por_vinculo_2025.png" id="24" name="Picture"/>
+                    <pic:cNvPr descr="../outputs/figures/02_docentes_por_vinculo_2025.png" id="25" name="Picture"/>
                     <pic:cNvPicPr>
                       <a:picLocks noChangeArrowheads="1" noChangeAspect="1"/>
                     </pic:cNvPicPr>
                   </pic:nvPicPr>
                   <pic:blipFill>
-                    <a:blip r:embed="rId22"/>
+                    <a:blip r:embed="rId23"/>
                     <a:stretch>
                       <a:fillRect/>
                     </a:stretch>
@@ -607,8 +752,8 @@
         <w:t xml:space="preserve">— trabalham sob contrato temporário. As categorias de CLT (1,8%) e terceirizado (0,7%) são residuais em termos nacionais, mas, como se verá na próxima seção, ganham peso em redes específicas (CLT é notavelmente mais comum na rede estadual e em São Paulo). O grupo dos contratados temporários é, disparadamente, o mais exposto a rotatividade, descontinuidade pedagógica e insegurança no emprego, e é o foco do restante deste relatório.</w:t>
       </w:r>
     </w:p>
-    <w:bookmarkEnd w:id="25"/>
-    <w:bookmarkStart w:id="29" w:name="Xf34784e0d3763dcb1e7920ac622fec6530d7a66"/>
+    <w:bookmarkEnd w:id="26"/>
+    <w:bookmarkStart w:id="30" w:name="Xf34784e0d3763dcb1e7920ac622fec6530d7a66"/>
     <w:p>
       <w:pPr>
         <w:pStyle w:val="Heading1"/>
@@ -643,18 +788,18 @@
           <wp:inline>
             <wp:extent cx="5334000" cy="3467100"/>
             <wp:effectExtent b="0" l="0" r="0" t="0"/>
-            <wp:docPr descr="Vínculo contratual por dependência administrativa, Brasil 2025" title="" id="27" name="Picture"/>
+            <wp:docPr descr="Vínculo contratual por dependência administrativa, Brasil 2025" title="" id="28" name="Picture"/>
             <a:graphic>
               <a:graphicData uri="http://schemas.openxmlformats.org/drawingml/2006/picture">
                 <pic:pic>
                   <pic:nvPicPr>
-                    <pic:cNvPr descr="../outputs/figures/03_vinculo_por_dependencia_2025.png" id="28" name="Picture"/>
+                    <pic:cNvPr descr="../outputs/figures/03_vinculo_por_dependencia_2025.png" id="29" name="Picture"/>
                     <pic:cNvPicPr>
                       <a:picLocks noChangeArrowheads="1" noChangeAspect="1"/>
                     </pic:cNvPicPr>
                   </pic:nvPicPr>
                   <pic:blipFill>
-                    <a:blip r:embed="rId26"/>
+                    <a:blip r:embed="rId27"/>
                     <a:stretch>
                       <a:fillRect/>
                     </a:stretch>
@@ -761,8 +906,8 @@
         <w:t xml:space="preserve">(651.655 docentes) não informa essa variável ao Censo.</w:t>
       </w:r>
     </w:p>
-    <w:bookmarkEnd w:id="29"/>
-    <w:bookmarkStart w:id="33" w:name="vínculo-por-localização-urbana-e-rural"/>
+    <w:bookmarkEnd w:id="30"/>
+    <w:bookmarkStart w:id="34" w:name="vínculo-por-localização-urbana-e-rural"/>
     <w:p>
       <w:pPr>
         <w:pStyle w:val="Heading1"/>
@@ -789,18 +934,18 @@
           <wp:inline>
             <wp:extent cx="5334000" cy="4333875"/>
             <wp:effectExtent b="0" l="0" r="0" t="0"/>
-            <wp:docPr descr="Vínculo contratual por localização urbana/rural, Brasil 2025" title="" id="31" name="Picture"/>
+            <wp:docPr descr="Vínculo contratual por localização urbana/rural, Brasil 2025" title="" id="32" name="Picture"/>
             <a:graphic>
               <a:graphicData uri="http://schemas.openxmlformats.org/drawingml/2006/picture">
                 <pic:pic>
                   <pic:nvPicPr>
-                    <pic:cNvPr descr="../outputs/figures/06_vinculo_por_localizacao_2025.png" id="32" name="Picture"/>
+                    <pic:cNvPr descr="../outputs/figures/06_vinculo_por_localizacao_2025.png" id="33" name="Picture"/>
                     <pic:cNvPicPr>
                       <a:picLocks noChangeArrowheads="1" noChangeAspect="1"/>
                     </pic:cNvPicPr>
                   </pic:nvPicPr>
                   <pic:blipFill>
-                    <a:blip r:embed="rId30"/>
+                    <a:blip r:embed="rId31"/>
                     <a:stretch>
                       <a:fillRect/>
                     </a:stretch>
@@ -856,8 +1001,8 @@
         <w:t xml:space="preserve">, contra 37,6% nas escolas urbanas (2.578.581 docentes, com 59,8% de concursados). Isso sugere que a fragilidade do vínculo contratual não está distribuída de forma uniforme pelo território: escolas rurais, tipicamente mais distantes e com menor atratividade para concursos e fixação de efetivos, dependem proporcionalmente mais de contratação temporária para preencher vagas docentes. Vale notar que a zona rural concentra uma fração pequena do total de docentes (13,8% do total nacional), então, em termos absolutos, o número de docentes contratados ainda é maior na zona urbana (735.483 contra 232.116 na zona rural) — mas proporcionalmente, é na zona rural que o vínculo precário é a norma, não a exceção.</w:t>
       </w:r>
     </w:p>
-    <w:bookmarkEnd w:id="33"/>
-    <w:bookmarkStart w:id="46" w:name="X613d81a28eb5aab539e921fd7936e59fe0c75c6"/>
+    <w:bookmarkEnd w:id="34"/>
+    <w:bookmarkStart w:id="47" w:name="X613d81a28eb5aab539e921fd7936e59fe0c75c6"/>
     <w:p>
       <w:pPr>
         <w:pStyle w:val="Heading1"/>
@@ -892,18 +1037,18 @@
           <wp:inline>
             <wp:extent cx="5334000" cy="2889250"/>
             <wp:effectExtent b="0" l="0" r="0" t="0"/>
-            <wp:docPr descr="Vínculo contratual por região, Brasil 2025" title="" id="35" name="Picture"/>
+            <wp:docPr descr="Vínculo contratual por região, Brasil 2025" title="" id="36" name="Picture"/>
             <a:graphic>
               <a:graphicData uri="http://schemas.openxmlformats.org/drawingml/2006/picture">
                 <pic:pic>
                   <pic:nvPicPr>
-                    <pic:cNvPr descr="../outputs/figures/10_vinculo_por_regiao_2025.png" id="36" name="Picture"/>
+                    <pic:cNvPr descr="../outputs/figures/10_vinculo_por_regiao_2025.png" id="37" name="Picture"/>
                     <pic:cNvPicPr>
                       <a:picLocks noChangeArrowheads="1" noChangeAspect="1"/>
                     </pic:cNvPicPr>
                   </pic:nvPicPr>
                   <pic:blipFill>
-                    <a:blip r:embed="rId34"/>
+                    <a:blip r:embed="rId35"/>
                     <a:stretch>
                       <a:fillRect/>
                     </a:stretch>
@@ -973,18 +1118,18 @@
           <wp:inline>
             <wp:extent cx="5334000" cy="4364181"/>
             <wp:effectExtent b="0" l="0" r="0" t="0"/>
-            <wp:docPr descr="Mapa do vínculo contratual por UF e categoria, Brasil 2025" title="" id="38" name="Picture"/>
+            <wp:docPr descr="Mapa do vínculo contratual por UF e categoria, Brasil 2025" title="" id="39" name="Picture"/>
             <a:graphic>
               <a:graphicData uri="http://schemas.openxmlformats.org/drawingml/2006/picture">
                 <pic:pic>
                   <pic:nvPicPr>
-                    <pic:cNvPr descr="../outputs/figures/07_mapa_vinculo_por_uf_2025.png" id="39" name="Picture"/>
+                    <pic:cNvPr descr="../outputs/figures/07_mapa_vinculo_por_uf_2025.png" id="40" name="Picture"/>
                     <pic:cNvPicPr>
                       <a:picLocks noChangeArrowheads="1" noChangeAspect="1"/>
                     </pic:cNvPicPr>
                   </pic:nvPicPr>
                   <pic:blipFill>
-                    <a:blip r:embed="rId37"/>
+                    <a:blip r:embed="rId38"/>
                     <a:stretch>
                       <a:fillRect/>
                     </a:stretch>
@@ -1036,18 +1181,18 @@
           <wp:inline>
             <wp:extent cx="5334000" cy="5334000"/>
             <wp:effectExtent b="0" l="0" r="0" t="0"/>
-            <wp:docPr descr="Ranking de UFs por % de docentes contratados, Brasil 2025" title="" id="41" name="Picture"/>
+            <wp:docPr descr="Ranking de UFs por % de docentes contratados, Brasil 2025" title="" id="42" name="Picture"/>
             <a:graphic>
               <a:graphicData uri="http://schemas.openxmlformats.org/drawingml/2006/picture">
                 <pic:pic>
                   <pic:nvPicPr>
-                    <pic:cNvPr descr="../outputs/figures/12_ranking_uf_contratados_2025.png" id="42" name="Picture"/>
+                    <pic:cNvPr descr="../outputs/figures/12_ranking_uf_contratados_2025.png" id="43" name="Picture"/>
                     <pic:cNvPicPr>
                       <a:picLocks noChangeArrowheads="1" noChangeAspect="1"/>
                     </pic:cNvPicPr>
                   </pic:nvPicPr>
                   <pic:blipFill>
-                    <a:blip r:embed="rId40"/>
+                    <a:blip r:embed="rId41"/>
                     <a:stretch>
                       <a:fillRect/>
                     </a:stretch>
@@ -1127,18 +1272,18 @@
           <wp:inline>
             <wp:extent cx="5334000" cy="4741333"/>
             <wp:effectExtent b="0" l="0" r="0" t="0"/>
-            <wp:docPr descr="Mapa do total de docentes por UF, Brasil 2025" title="" id="44" name="Picture"/>
+            <wp:docPr descr="Mapa do total de docentes por UF, Brasil 2025" title="" id="45" name="Picture"/>
             <a:graphic>
               <a:graphicData uri="http://schemas.openxmlformats.org/drawingml/2006/picture">
                 <pic:pic>
                   <pic:nvPicPr>
-                    <pic:cNvPr descr="../outputs/figures/04a_mapa_docentes_total_uf_2025.png" id="45" name="Picture"/>
+                    <pic:cNvPr descr="../outputs/figures/04a_mapa_docentes_total_uf_2025.png" id="46" name="Picture"/>
                     <pic:cNvPicPr>
                       <a:picLocks noChangeArrowheads="1" noChangeAspect="1"/>
                     </pic:cNvPicPr>
                   </pic:nvPicPr>
                   <pic:blipFill>
-                    <a:blip r:embed="rId43"/>
+                    <a:blip r:embed="rId44"/>
                     <a:stretch>
                       <a:fillRect/>
                     </a:stretch>
@@ -1173,8 +1318,8 @@
         <w:t xml:space="preserve">Mapa do total de docentes por UF, Brasil 2025</w:t>
       </w:r>
     </w:p>
-    <w:bookmarkEnd w:id="46"/>
-    <w:bookmarkStart w:id="53" w:name="X3035066a012d73c112832aa2ea2b41bcf8a4d47"/>
+    <w:bookmarkEnd w:id="47"/>
+    <w:bookmarkStart w:id="54" w:name="X3035066a012d73c112832aa2ea2b41bcf8a4d47"/>
     <w:p>
       <w:pPr>
         <w:pStyle w:val="Heading1"/>
@@ -1209,18 +1354,18 @@
           <wp:inline>
             <wp:extent cx="5334000" cy="3111500"/>
             <wp:effectExtent b="0" l="0" r="0" t="0"/>
-            <wp:docPr descr="Ranking de municípios com maior e menor % de docentes contratados, Brasil 2025" title="" id="48" name="Picture"/>
+            <wp:docPr descr="Ranking de municípios com maior e menor % de docentes contratados, Brasil 2025" title="" id="49" name="Picture"/>
             <a:graphic>
               <a:graphicData uri="http://schemas.openxmlformats.org/drawingml/2006/picture">
                 <pic:pic>
                   <pic:nvPicPr>
-                    <pic:cNvPr descr="../outputs/figures/11_ranking_municipios_contratados_2025.png" id="49" name="Picture"/>
+                    <pic:cNvPr descr="../outputs/figures/11_ranking_municipios_contratados_2025.png" id="50" name="Picture"/>
                     <pic:cNvPicPr>
                       <a:picLocks noChangeArrowheads="1" noChangeAspect="1"/>
                     </pic:cNvPicPr>
                   </pic:nvPicPr>
                   <pic:blipFill>
-                    <a:blip r:embed="rId47"/>
+                    <a:blip r:embed="rId48"/>
                     <a:stretch>
                       <a:fillRect/>
                     </a:stretch>
@@ -1333,18 +1478,18 @@
           <wp:inline>
             <wp:extent cx="5334000" cy="5926666"/>
             <wp:effectExtent b="0" l="0" r="0" t="0"/>
-            <wp:docPr descr="Variabilidade da % de docentes contratados entre municípios, por UF" title="" id="51" name="Picture"/>
+            <wp:docPr descr="Variabilidade da % de docentes contratados entre municípios, por UF" title="" id="52" name="Picture"/>
             <a:graphic>
               <a:graphicData uri="http://schemas.openxmlformats.org/drawingml/2006/picture">
                 <pic:pic>
                   <pic:nvPicPr>
-                    <pic:cNvPr descr="../outputs/figures/13_boxplot_contratados_por_uf_2025.png" id="52" name="Picture"/>
+                    <pic:cNvPr descr="../outputs/figures/13_boxplot_contratados_por_uf_2025.png" id="53" name="Picture"/>
                     <pic:cNvPicPr>
                       <a:picLocks noChangeArrowheads="1" noChangeAspect="1"/>
                     </pic:cNvPicPr>
                   </pic:nvPicPr>
                   <pic:blipFill>
-                    <a:blip r:embed="rId50"/>
+                    <a:blip r:embed="rId51"/>
                     <a:stretch>
                       <a:fillRect/>
                     </a:stretch>
@@ -1423,8 +1568,8 @@
         <w:t xml:space="preserve">— inclusive municípios com pouquíssima dependência de contratação temporária e municípios quase inteiramente dependentes dela, dentro do mesmo estado.</w:t>
       </w:r>
     </w:p>
-    <w:bookmarkEnd w:id="53"/>
-    <w:bookmarkStart w:id="63" w:name="X82d93af8bc1fed457c5da4139897e89f7475159"/>
+    <w:bookmarkEnd w:id="54"/>
+    <w:bookmarkStart w:id="64" w:name="X82d93af8bc1fed457c5da4139897e89f7475159"/>
     <w:p>
       <w:pPr>
         <w:pStyle w:val="Heading1"/>
@@ -1490,18 +1635,18 @@
           <wp:inline>
             <wp:extent cx="5334000" cy="3467100"/>
             <wp:effectExtent b="0" l="0" r="0" t="0"/>
-            <wp:docPr descr="Docentes da educação básica por etapa, Brasil 2015-2025" title="" id="55" name="Picture"/>
+            <wp:docPr descr="Docentes da educação básica por etapa, Brasil 2015-2025" title="" id="56" name="Picture"/>
             <a:graphic>
               <a:graphicData uri="http://schemas.openxmlformats.org/drawingml/2006/picture">
                 <pic:pic>
                   <pic:nvPicPr>
-                    <pic:cNvPr descr="../outputs/figures/01_docentes_por_etapa_2015_2025.png" id="56" name="Picture"/>
+                    <pic:cNvPr descr="../outputs/figures/01_docentes_por_etapa_2015_2025.png" id="57" name="Picture"/>
                     <pic:cNvPicPr>
                       <a:picLocks noChangeArrowheads="1" noChangeAspect="1"/>
                     </pic:cNvPicPr>
                   </pic:nvPicPr>
                   <pic:blipFill>
-                    <a:blip r:embed="rId54"/>
+                    <a:blip r:embed="rId55"/>
                     <a:stretch>
                       <a:fillRect/>
                     </a:stretch>
@@ -1590,18 +1735,18 @@
           <wp:inline>
             <wp:extent cx="5334000" cy="3879272"/>
             <wp:effectExtent b="0" l="0" r="0" t="0"/>
-            <wp:docPr descr="Docentes por etapa e dependência administrativa, Brasil 2015-2025" title="" id="58" name="Picture"/>
+            <wp:docPr descr="Docentes por etapa e dependência administrativa, Brasil 2015-2025" title="" id="59" name="Picture"/>
             <a:graphic>
               <a:graphicData uri="http://schemas.openxmlformats.org/drawingml/2006/picture">
                 <pic:pic>
                   <pic:nvPicPr>
-                    <pic:cNvPr descr="../outputs/figures/08_etapa_por_dependencia_2015_2025.png" id="59" name="Picture"/>
+                    <pic:cNvPr descr="../outputs/figures/08_etapa_por_dependencia_2015_2025.png" id="60" name="Picture"/>
                     <pic:cNvPicPr>
                       <a:picLocks noChangeArrowheads="1" noChangeAspect="1"/>
                     </pic:cNvPicPr>
                   </pic:nvPicPr>
                   <pic:blipFill>
-                    <a:blip r:embed="rId57"/>
+                    <a:blip r:embed="rId58"/>
                     <a:stretch>
                       <a:fillRect/>
                     </a:stretch>
@@ -1717,18 +1862,18 @@
           <wp:inline>
             <wp:extent cx="5334000" cy="3467100"/>
             <wp:effectExtent b="0" l="0" r="0" t="0"/>
-            <wp:docPr descr="Docentes por etapa e localização, Brasil 2015-2025" title="" id="61" name="Picture"/>
+            <wp:docPr descr="Docentes por etapa e localização, Brasil 2015-2025" title="" id="62" name="Picture"/>
             <a:graphic>
               <a:graphicData uri="http://schemas.openxmlformats.org/drawingml/2006/picture">
                 <pic:pic>
                   <pic:nvPicPr>
-                    <pic:cNvPr descr="../outputs/figures/09_etapa_por_localizacao_2015_2025.png" id="62" name="Picture"/>
+                    <pic:cNvPr descr="../outputs/figures/09_etapa_por_localizacao_2015_2025.png" id="63" name="Picture"/>
                     <pic:cNvPicPr>
                       <a:picLocks noChangeArrowheads="1" noChangeAspect="1"/>
                     </pic:cNvPicPr>
                   </pic:nvPicPr>
                   <pic:blipFill>
-                    <a:blip r:embed="rId60"/>
+                    <a:blip r:embed="rId61"/>
                     <a:stretch>
                       <a:fillRect/>
                     </a:stretch>
@@ -1797,8 +1942,8 @@
         <w:t xml:space="preserve">, o padrão histórico se inverte ao final da série: os anos iniciais do fundamental, que começam a década como a segunda maior categoria (cerca de 705 mil docentes, atrás dos anos finais), terminam 2025 como a maior de todas (886 mil); a educação infantil urbana tem o crescimento mais acentuado (de aproximadamente 486 mil para 654 mil docentes, +35%), com um degrau bem marcado entre 2020 e 2022, coincidindo com o período pós-pandemia.</w:t>
       </w:r>
     </w:p>
-    <w:bookmarkEnd w:id="63"/>
-    <w:bookmarkStart w:id="70" w:name="X7d57533f02b93739dd65f1b292d908852c17548"/>
+    <w:bookmarkEnd w:id="64"/>
+    <w:bookmarkStart w:id="71" w:name="X7d57533f02b93739dd65f1b292d908852c17548"/>
     <w:p>
       <w:pPr>
         <w:pStyle w:val="Heading1"/>
@@ -2545,18 +2690,18 @@
           <wp:inline>
             <wp:extent cx="5334000" cy="2461846"/>
             <wp:effectExtent b="0" l="0" r="0" t="0"/>
-            <wp:docPr descr="Dispersão entre % de docentes contratados e IDEB, por município e etapa" title="" id="65" name="Picture"/>
+            <wp:docPr descr="Dispersão entre % de docentes contratados e IDEB, por município e etapa" title="" id="66" name="Picture"/>
             <a:graphic>
               <a:graphicData uri="http://schemas.openxmlformats.org/drawingml/2006/picture">
                 <pic:pic>
                   <pic:nvPicPr>
-                    <pic:cNvPr descr="../outputs/figures/15_dispersao_contratados_ideb_municipio_2025.png" id="66" name="Picture"/>
+                    <pic:cNvPr descr="../outputs/figures/15_dispersao_contratados_ideb_municipio_2025.png" id="67" name="Picture"/>
                     <pic:cNvPicPr>
                       <a:picLocks noChangeArrowheads="1" noChangeAspect="1"/>
                     </pic:cNvPicPr>
                   </pic:nvPicPr>
                   <pic:blipFill>
-                    <a:blip r:embed="rId64"/>
+                    <a:blip r:embed="rId65"/>
                     <a:stretch>
                       <a:fillRect/>
                     </a:stretch>
@@ -2600,18 +2745,18 @@
           <wp:inline>
             <wp:extent cx="5334000" cy="2461846"/>
             <wp:effectExtent b="0" l="0" r="0" t="0"/>
-            <wp:docPr descr="Dispersão entre % de docentes contratados e IDEB, por UF e etapa" title="" id="68" name="Picture"/>
+            <wp:docPr descr="Dispersão entre % de docentes contratados e IDEB, por UF e etapa" title="" id="69" name="Picture"/>
             <a:graphic>
               <a:graphicData uri="http://schemas.openxmlformats.org/drawingml/2006/picture">
                 <pic:pic>
                   <pic:nvPicPr>
-                    <pic:cNvPr descr="../outputs/figures/16_dispersao_contratados_ideb_uf_2025.png" id="69" name="Picture"/>
+                    <pic:cNvPr descr="../outputs/figures/16_dispersao_contratados_ideb_uf_2025.png" id="70" name="Picture"/>
                     <pic:cNvPicPr>
                       <a:picLocks noChangeArrowheads="1" noChangeAspect="1"/>
                     </pic:cNvPicPr>
                   </pic:nvPicPr>
                   <pic:blipFill>
-                    <a:blip r:embed="rId67"/>
+                    <a:blip r:embed="rId68"/>
                     <a:stretch>
                       <a:fillRect/>
                     </a:stretch>
@@ -2663,8 +2808,8 @@
         <w:t xml:space="preserve">) nem uma relação linear forte em nenhuma direção. No gráfico por UF, é possível ver, por exemplo, que Roraima (RR) e Rio de Janeiro (RJ) têm IDEB relativamente baixo com percentuais de contratados muito diferentes entre si (RR tem um dos maiores percentuais de concursados do país, RJ tem o maior percentual de concursados de todos), o que já ilustra, por si só, que o vínculo contratual não é um previsor consistente do IDEB quando se olha caso a caso.</w:t>
       </w:r>
     </w:p>
-    <w:bookmarkEnd w:id="70"/>
-    <w:bookmarkStart w:id="71" w:name="discussão-e-síntese-das-conclusões"/>
+    <w:bookmarkEnd w:id="71"/>
+    <w:bookmarkStart w:id="72" w:name="discussão-e-síntese-das-conclusões"/>
     <w:p>
       <w:pPr>
         <w:pStyle w:val="Heading1"/>
@@ -2686,7 +2831,7 @@
       <w:pPr>
         <w:numPr>
           <w:ilvl w:val="0"/>
-          <w:numId w:val="1002"/>
+          <w:numId w:val="1003"/>
         </w:numPr>
       </w:pPr>
       <w:r>
@@ -2707,7 +2852,7 @@
       <w:pPr>
         <w:numPr>
           <w:ilvl w:val="0"/>
-          <w:numId w:val="1002"/>
+          <w:numId w:val="1003"/>
         </w:numPr>
       </w:pPr>
       <w:r>
@@ -2734,7 +2879,7 @@
       <w:pPr>
         <w:numPr>
           <w:ilvl w:val="0"/>
-          <w:numId w:val="1002"/>
+          <w:numId w:val="1003"/>
         </w:numPr>
       </w:pPr>
       <w:r>
@@ -2752,7 +2897,7 @@
       <w:pPr>
         <w:numPr>
           <w:ilvl w:val="0"/>
-          <w:numId w:val="1002"/>
+          <w:numId w:val="1003"/>
         </w:numPr>
       </w:pPr>
       <w:r>
@@ -2773,7 +2918,7 @@
       <w:pPr>
         <w:numPr>
           <w:ilvl w:val="0"/>
-          <w:numId w:val="1002"/>
+          <w:numId w:val="1003"/>
         </w:numPr>
       </w:pPr>
       <w:r>
@@ -2791,7 +2936,7 @@
       <w:pPr>
         <w:numPr>
           <w:ilvl w:val="0"/>
-          <w:numId w:val="1002"/>
+          <w:numId w:val="1003"/>
         </w:numPr>
       </w:pPr>
       <w:r>
@@ -2812,7 +2957,7 @@
       <w:pPr>
         <w:numPr>
           <w:ilvl w:val="0"/>
-          <w:numId w:val="1002"/>
+          <w:numId w:val="1003"/>
         </w:numPr>
       </w:pPr>
       <w:r>
@@ -2833,7 +2978,7 @@
       <w:pPr>
         <w:numPr>
           <w:ilvl w:val="0"/>
-          <w:numId w:val="1002"/>
+          <w:numId w:val="1003"/>
         </w:numPr>
       </w:pPr>
       <w:r>
@@ -2854,7 +2999,7 @@
       <w:pPr>
         <w:numPr>
           <w:ilvl w:val="0"/>
-          <w:numId w:val="1002"/>
+          <w:numId w:val="1003"/>
         </w:numPr>
       </w:pPr>
       <w:r>
@@ -2879,8 +3024,8 @@
         <w:t xml:space="preserve">Em conjunto, esses resultados sugerem que o problema da contratação temporária no magistério público brasileiro é real, expressivo e desigualmente distribuído (por rede, por localização, por região e, principalmente, por município), mas que seu impacto direto e isolado sobre o indicador de desempenho educacional mais usado no país (o IDEB) é, com os dados de 2025, estatisticamente fraco. Isso não significa que o vínculo contratual seja irrelevante para a qualidade da educação — apenas que essa relação, se existir de forma mais substantiva, provavelmente opera de forma indireta ou em conjunto com outros fatores, e não como uma relação simples e direta capturada por uma correlação bivariada.</w:t>
       </w:r>
     </w:p>
-    <w:bookmarkEnd w:id="71"/>
-    <w:bookmarkStart w:id="72" w:name="fontes-e-material-de-apoio"/>
+    <w:bookmarkEnd w:id="72"/>
+    <w:bookmarkStart w:id="73" w:name="fontes-e-material-de-apoio"/>
     <w:p>
       <w:pPr>
         <w:pStyle w:val="Heading1"/>
@@ -2975,7 +3120,7 @@
         <w:t xml:space="preserve">).</w:t>
       </w:r>
     </w:p>
-    <w:bookmarkEnd w:id="72"/>
+    <w:bookmarkEnd w:id="73"/>
     <w:sectPr>
       <w:footerReference r:id="rId9" w:type="default"/>
       <w:footnotePr>
@@ -3307,6 +3452,9 @@
     <w:abstractNumId w:val="991"/>
   </w:num>
   <w:num w:numId="1002">
+    <w:abstractNumId w:val="991"/>
+  </w:num>
+  <w:num w:numId="1003">
     <w:abstractNumId w:val="99411"/>
     <w:lvlOverride w:ilvl="0">
       <w:startOverride w:val="1"/>

</xml_diff>